<commit_message>
feat(demo): version demo publique bridee (DEMO_BRIDEE) + actes fictifs KACEM
</commit_message>
<xml_diff>
--- a/backend/src/main/resources/templates/modele_frida.docx
+++ b/backend/src/main/resources/templates/modele_frida.docx
@@ -2,189 +2,314 @@
 <file path=word/document.xml><?xml version="1.0" encoding="utf-8"?>
 <w:document xmlns:wpc="http://schemas.microsoft.com/office/word/2010/wordprocessingCanvas" xmlns:mo="http://schemas.microsoft.com/office/mac/office/2008/main" xmlns:mc="http://schemas.openxmlformats.org/markup-compatibility/2006" xmlns:mv="urn:schemas-microsoft-com:mac:vml" xmlns:o="urn:schemas-microsoft-com:office:office" xmlns:r="http://schemas.openxmlformats.org/officeDocument/2006/relationships" xmlns:m="http://schemas.openxmlformats.org/officeDocument/2006/math" xmlns:v="urn:schemas-microsoft-com:vml" xmlns:wp14="http://schemas.microsoft.com/office/word/2010/wordprocessingDrawing" xmlns:wp="http://schemas.openxmlformats.org/drawingml/2006/wordprocessingDrawing" xmlns:w10="urn:schemas-microsoft-com:office:word" xmlns:w="http://schemas.openxmlformats.org/wordprocessingml/2006/main" xmlns:w14="http://schemas.microsoft.com/office/word/2010/wordml" xmlns:wpg="http://schemas.microsoft.com/office/word/2010/wordprocessingGroup" xmlns:wpi="http://schemas.microsoft.com/office/word/2010/wordprocessingInk" xmlns:wne="http://schemas.microsoft.com/office/word/2006/wordml" xmlns:wps="http://schemas.microsoft.com/office/word/2010/wordprocessingShape" mc:Ignorable="w14 wp14">
   <w:body>
+    <!-- En-tête officiel centré -->
     <w:p>
       <w:pPr>
+        <w:bidi/>
+        <w:spacing w:after="160" w:line="320" w:lineRule="auto"/>
         <w:jc w:val="center"/>
       </w:pPr>
       <w:r>
         <w:rPr>
+          <w:rFonts w:ascii="Traditional Arabic" w:hAnsi="Traditional Arabic" w:cs="Traditional Arabic"/>
           <w:b/>
-          <w:sz w:val="32"/>
+          <w:bCs/>
+          <w:sz w:val="30"/>
+          <w:szCs w:val="30"/>
+          <w:rtl/>
         </w:rPr>
         <w:t>الجمهورية الجزائرية الديمقراطية الشعبية</w:t>
         <w:br/>
         <w:t>وزارة العدل</w:t>
       </w:r>
     </w:p>
+    <!-- Tableau d'en-tête sans bordure : Droite (Notaire + rue + ville) / Gauche (Numéro + Date) -->
+    <w:tbl>
+      <w:tblPr>
+        <w:bidiVisual/>
+        <w:tblW w:w="8504" w:type="dxa"/>
+        <w:tblBorders>
+          <w:top w:val="none" w:sz="0" w:space="0" w:color="auto"/>
+          <w:left w:val="none" w:sz="0" w:space="0" w:color="auto"/>
+          <w:bottom w:val="none" w:sz="0" w:space="0" w:color="auto"/>
+          <w:right w:val="none" w:sz="0" w:space="0" w:color="auto"/>
+          <w:insideH w:val="none" w:sz="0" w:space="0" w:color="auto"/>
+          <w:insideV w:val="none" w:sz="0" w:space="0" w:color="auto"/>
+        </w:tblBorders>
+      </w:tblPr>
+      <w:tblGrid>
+        <w:gridCol w:w="5000"/>
+        <w:gridCol w:w="3504"/>
+      </w:tblGrid>
+      <w:tr>
+        <w:tc>
+          <w:tcPr>
+            <w:tcW w:w="5000" w:type="dxa"/>
+          </w:tcPr>
+          <w:p>
+            <w:pPr>
+              <w:bidi/>
+              <w:spacing w:after="40" w:line="280" w:lineRule="auto"/>
+            </w:pPr>
+            <w:r>
+              <w:rPr>
+                <w:rFonts w:ascii="Traditional Arabic" w:hAnsi="Traditional Arabic" w:cs="Traditional Arabic"/>
+                <w:b/>
+                <w:bCs/>
+                <w:sz w:val="26"/>
+                <w:szCs w:val="26"/>
+                <w:rtl/>
+              </w:rPr>
+              <w:t>{{notaire}}</w:t>
+            </w:r>
+            <w:r>
+              <w:rPr>
+                <w:rFonts w:ascii="Traditional Arabic" w:hAnsi="Traditional Arabic" w:cs="Traditional Arabic"/>
+                <w:sz w:val="24"/>
+                <w:szCs w:val="24"/>
+                <w:rtl/>
+              </w:rPr>
+              <w:br/>
+              <w:t>{{notaire_adresse}}</w:t>
+            </w:r>
+          </w:p>
+        </w:tc>
+        <w:tc>
+          <w:tcPr>
+            <w:tcW w:w="3504" w:type="dxa"/>
+          </w:tcPr>
+          <w:p>
+            <w:pPr>
+              <w:bidi w:val="0"/>
+              <w:spacing w:after="40" w:line="280" w:lineRule="auto"/>
+              <w:jc w:val="left"/>
+            </w:pPr>
+            <w:r>
+              <w:rPr>
+                <w:rFonts w:ascii="Traditional Arabic" w:hAnsi="Traditional Arabic" w:cs="Traditional Arabic"/>
+                <w:b/>
+                <w:bCs/>
+                <w:sz w:val="24"/>
+                <w:szCs w:val="24"/>
+                <w:rtl/>
+              </w:rPr>
+              <w:t>رقم : {{num_frida}}</w:t>
+              <w:br/>
+              <w:t>بتاريخ : {{date_creation}}</w:t>
+            </w:r>
+          </w:p>
+        </w:tc>
+      </w:tr>
+    </w:tbl>
+    <!-- Titre principal : فـريـضـة -->
     <w:p>
       <w:pPr>
-        <w:jc w:val="right"/>
+        <w:bidi/>
+        <w:spacing w:before="200" w:after="60"/>
+        <w:jc w:val="center"/>
       </w:pPr>
       <w:r>
         <w:rPr>
+          <w:rFonts w:ascii="Traditional Arabic" w:hAnsi="Traditional Arabic" w:cs="Traditional Arabic"/>
           <w:b/>
+          <w:bCs/>
+          <w:sz w:val="44"/>
+          <w:szCs w:val="44"/>
+          <w:u w:val="single"/>
+          <w:rtl/>
         </w:rPr>
-        <w:t xml:space="preserve">مكتب الموثق(ة): </w:t>
+        <w:t>فـريـضـة</w:t>
+      </w:r>
+    </w:p>
+    <!-- Sous-titre : المرحوم(ة) : الاسم واللقب -->
+    <w:p>
+      <w:pPr>
+        <w:bidi/>
+        <w:spacing w:after="240"/>
+        <w:jc w:val="center"/>
+      </w:pPr>
+      <w:r>
+        <w:rPr>
+          <w:rFonts w:ascii="Traditional Arabic" w:hAnsi="Traditional Arabic" w:cs="Traditional Arabic"/>
+          <w:b/>
+          <w:bCs/>
+          <w:sz w:val="32"/>
+          <w:szCs w:val="32"/>
+          <w:rtl/>
+        </w:rPr>
+        <w:t>{{defunt_titre}} : {{defunt_nom}} {{defunt_prenom}}</w:t>
+      </w:r>
+    </w:p>
+    <!-- Section Déclaration du défunt -->
+    <w:p>
+      <w:pPr>
+        <w:bidi/>
+        <w:spacing w:after="200" w:line="360" w:lineRule="auto"/>
+        <w:jc w:val="both"/>
+      </w:pPr>
+      <w:r>
+        <w:rPr>
+          <w:rFonts w:ascii="Traditional Arabic" w:hAnsi="Traditional Arabic" w:cs="Traditional Arabic"/>
+          <w:sz w:val="26"/>
+          <w:szCs w:val="26"/>
+          <w:rtl/>
+        </w:rPr>
+        <w:t xml:space="preserve">بناءً على طلب المعنيين، حضر أمامنا نحن الأستاذ(ة) </w:t>
       </w:r>
       <w:r>
+        <w:rPr>
+          <w:rFonts w:ascii="Traditional Arabic" w:hAnsi="Traditional Arabic" w:cs="Traditional Arabic"/>
+          <w:b/>
+          <w:bCs/>
+          <w:sz w:val="26"/>
+          <w:szCs w:val="26"/>
+          <w:rtl/>
+        </w:rPr>
         <w:t>{{notaire}}</w:t>
-        <w:br/>
       </w:r>
       <w:r>
-        <w:t>{{notaire_adresse}}</w:t>
+        <w:rPr>
+          <w:rFonts w:ascii="Traditional Arabic" w:hAnsi="Traditional Arabic" w:cs="Traditional Arabic"/>
+          <w:sz w:val="26"/>
+          <w:szCs w:val="26"/>
+          <w:rtl/>
+        </w:rPr>
+        <w:t xml:space="preserve">، الموثق(ة)، لإثبات فريضة {{defunt_titre}} : </w:t>
+      </w:r>
+      <w:r>
+        <w:rPr>
+          <w:rFonts w:ascii="Traditional Arabic" w:hAnsi="Traditional Arabic" w:cs="Traditional Arabic"/>
+          <w:b/>
+          <w:bCs/>
+          <w:sz w:val="26"/>
+          <w:szCs w:val="26"/>
+          <w:rtl/>
+        </w:rPr>
+        <w:t>{{defunt_nom}} {{defunt_prenom}}</w:t>
+      </w:r>
+      <w:r>
+        <w:rPr>
+          <w:rFonts w:ascii="Traditional Arabic" w:hAnsi="Traditional Arabic" w:cs="Traditional Arabic"/>
+          <w:sz w:val="26"/>
+          <w:szCs w:val="26"/>
+          <w:rtl/>
+        </w:rPr>
+        <w:t xml:space="preserve">، {{defunt_fils}} </w:t>
+      </w:r>
+      <w:r>
+        <w:rPr>
+          <w:rFonts w:ascii="Traditional Arabic" w:hAnsi="Traditional Arabic" w:cs="Traditional Arabic"/>
+          <w:b/>
+          <w:bCs/>
+          <w:sz w:val="26"/>
+          <w:szCs w:val="26"/>
+          <w:rtl/>
+        </w:rPr>
+        <w:t>{{defunt_pere}}</w:t>
+      </w:r>
+      <w:r>
+        <w:rPr>
+          <w:rFonts w:ascii="Traditional Arabic" w:hAnsi="Traditional Arabic" w:cs="Traditional Arabic"/>
+          <w:sz w:val="26"/>
+          <w:szCs w:val="26"/>
+          <w:rtl/>
+        </w:rPr>
+        <w:t xml:space="preserve"> و </w:t>
+      </w:r>
+      <w:r>
+        <w:rPr>
+          <w:rFonts w:ascii="Traditional Arabic" w:hAnsi="Traditional Arabic" w:cs="Traditional Arabic"/>
+          <w:b/>
+          <w:bCs/>
+          <w:sz w:val="26"/>
+          <w:szCs w:val="26"/>
+          <w:rtl/>
+        </w:rPr>
+        <w:t>{{defunt_mere}}</w:t>
+      </w:r>
+      <w:r>
+        <w:rPr>
+          <w:rFonts w:ascii="Traditional Arabic" w:hAnsi="Traditional Arabic" w:cs="Traditional Arabic"/>
+          <w:sz w:val="26"/>
+          <w:szCs w:val="26"/>
+          <w:rtl/>
+        </w:rPr>
+        <w:t xml:space="preserve">، {{defunt_ne}} بتاريخ </w:t>
+      </w:r>
+      <w:r>
+        <w:rPr>
+          <w:rFonts w:ascii="Traditional Arabic" w:hAnsi="Traditional Arabic" w:cs="Traditional Arabic"/>
+          <w:b/>
+          <w:bCs/>
+          <w:sz w:val="26"/>
+          <w:szCs w:val="26"/>
+          <w:rtl/>
+        </w:rPr>
+        <w:t>{{defunt_date_naiss}}</w:t>
+      </w:r>
+      <w:r>
+        <w:rPr>
+          <w:rFonts w:ascii="Traditional Arabic" w:hAnsi="Traditional Arabic" w:cs="Traditional Arabic"/>
+          <w:sz w:val="26"/>
+          <w:szCs w:val="26"/>
+          <w:rtl/>
+        </w:rPr>
+        <w:t xml:space="preserve"> بـ </w:t>
+      </w:r>
+      <w:r>
+        <w:rPr>
+          <w:rFonts w:ascii="Traditional Arabic" w:hAnsi="Traditional Arabic" w:cs="Traditional Arabic"/>
+          <w:b/>
+          <w:bCs/>
+          <w:sz w:val="26"/>
+          <w:szCs w:val="26"/>
+          <w:rtl/>
+        </w:rPr>
+        <w:t>{{defunt_lieu_naiss}}</w:t>
+      </w:r>
+      <w:r>
+        <w:rPr>
+          <w:rFonts w:ascii="Traditional Arabic" w:hAnsi="Traditional Arabic" w:cs="Traditional Arabic"/>
+          <w:sz w:val="26"/>
+          <w:szCs w:val="26"/>
+          <w:rtl/>
+        </w:rPr>
+        <w:t>{{defunt_wilaya_text}}، من جنسية جزائرية،{{defunt_nin_text}}{{defunt_deces_text}}{{defunt_acte_text}}</w:t>
+      </w:r>
+    </w:p>
+    <!-- Section Témoins -->
+    <w:p>
+      <w:pPr>
+        <w:bidi/>
+        <w:tabs>
+          <w:tab w:val="left" w:leader="hyphen" w:pos="8504"/>
+        </w:tabs>
+        <w:spacing w:before="120" w:after="80" w:line="340" w:lineRule="auto"/>
+      </w:pPr>
+      <w:r>
+        <w:rPr>
+          <w:rFonts w:ascii="Traditional Arabic" w:hAnsi="Traditional Arabic" w:cs="Traditional Arabic"/>
+          <w:b/>
+          <w:bCs/>
+          <w:sz w:val="28"/>
+          <w:szCs w:val="28"/>
+          <w:rtl/>
+        </w:rPr>
+        <w:t xml:space="preserve">بشهادة كل من : </w:t>
+      </w:r>
+      <w:r>
+        <w:tab/>
+      </w:r>
+      <w:r>
+        <w:rPr>
+          <w:sz w:val="24"/>
+        </w:rPr>
+        <w:t>-</w:t>
       </w:r>
     </w:p>
     <w:p>
       <w:pPr>
-        <w:jc w:val="left"/>
-      </w:pPr>
-      <w:r>
-        <w:t>رقم: {{num_frida}}</w:t>
-        <w:br/>
-      </w:r>
-      <w:r>
-        <w:t>بتاريخ: {{date_creation}}</w:t>
-      </w:r>
-    </w:p>
-    <w:p>
-      <w:pPr>
-        <w:jc w:val="center"/>
-      </w:pPr>
-      <w:r>
-        <w:rPr>
-          <w:b/>
-          <w:sz w:val="40"/>
-          <w:u w:val="single"/>
-        </w:rPr>
-        <w:t>فـريـضـة</w:t>
-      </w:r>
-    </w:p>
-    <w:p>
-      <w:pPr>
-        <w:jc w:val="center"/>
-      </w:pPr>
-      <w:r>
-        <w:rPr>
-          <w:b/>
-        </w:rPr>
-        <w:t>{{defunt_titre}}: {{defunt_nom}} {{defunt_prenom}}</w:t>
-      </w:r>
-    </w:p>
-    <w:p>
-      <w:pPr>
-        <w:jc w:val="right"/>
-      </w:pPr>
-      <w:r>
-        <w:t xml:space="preserve">بناءً على طلب المعنيين، حضر أمامنا نحن الأستاذ(ة) </w:t>
-      </w:r>
-      <w:r>
-        <w:rPr>
-          <w:b/>
-        </w:rPr>
-        <w:t>{{notaire}}</w:t>
-      </w:r>
-      <w:r>
-        <w:t xml:space="preserve">، الموثق(ة)، لإثبات فريضة </w:t>
-      </w:r>
-      <w:r>
-        <w:rPr>
-          <w:b/>
-        </w:rPr>
-        <w:t xml:space="preserve">{{defunt_titre}}: </w:t>
-      </w:r>
-      <w:r>
-        <w:rPr>
-          <w:b/>
-        </w:rPr>
-        <w:t>{{defunt_nom}} {{defunt_prenom}}</w:t>
-      </w:r>
-      <w:r>
-        <w:t xml:space="preserve">، </w:t>
-      </w:r>
-      <w:r>
-        <w:rPr>
-          <w:b/>
-        </w:rPr>
-        <w:t xml:space="preserve">{{defunt_fils}} </w:t>
-      </w:r>
-      <w:r>
-        <w:rPr>
-          <w:b/>
-        </w:rPr>
-        <w:t>{{defunt_pere}}</w:t>
-      </w:r>
-      <w:r>
-        <w:t xml:space="preserve"> و </w:t>
-      </w:r>
-      <w:r>
-        <w:rPr>
-          <w:b/>
-        </w:rPr>
-        <w:t>{{defunt_mere}}</w:t>
-      </w:r>
-      <w:r>
-        <w:t xml:space="preserve">، </w:t>
-      </w:r>
-      <w:r>
-        <w:rPr>
-          <w:b/>
-        </w:rPr>
-        <w:t>{{defunt_ne}}</w:t>
-      </w:r>
-      <w:r>
-        <w:t xml:space="preserve"> بتاريخ </w:t>
-      </w:r>
-      <w:r>
-        <w:rPr>
-          <w:b/>
-        </w:rPr>
-        <w:t>{{defunt_date_naiss}}</w:t>
-      </w:r>
-      <w:r>
-        <w:t xml:space="preserve"> بـ </w:t>
-      </w:r>
-      <w:r>
-        <w:rPr>
-          <w:b/>
-        </w:rPr>
-        <w:t>{{defunt_lieu_naiss}}</w:t>
-      </w:r>
-      <w:r>
-        <w:t xml:space="preserve">، من جنسية جزائرية، </w:t>
-      </w:r>
-      <w:r>
-        <w:rPr>
-          <w:b/>
-        </w:rPr>
-        <w:t>{{defunt_mort}}</w:t>
-      </w:r>
-      <w:r>
-        <w:t xml:space="preserve"> بتاريخ </w:t>
-      </w:r>
-      <w:r>
-        <w:rPr>
-          <w:b/>
-        </w:rPr>
-        <w:t>{{defunt_date_deces}}</w:t>
-      </w:r>
-      <w:r>
-        <w:t>.</w:t>
-      </w:r>
-    </w:p>
-    <w:p>
-      <w:pPr>
-        <w:jc w:val="right"/>
-      </w:pPr>
-      <w:r>
-        <w:rPr>
-          <w:b/>
-        </w:rPr>
-        <w:t>بشهادة كل من :</w:t>
-      </w:r>
-    </w:p>
-    <w:p>
-      <w:pPr>
-        <w:jc w:val="right"/>
+        <w:bidi/>
       </w:pPr>
       <w:r>
         <w:t>{{?temoins}}</w:t>
@@ -192,42 +317,94 @@
     </w:p>
     <w:p>
       <w:pPr>
-        <w:jc w:val="right"/>
+        <w:bidi/>
+        <w:tabs>
+          <w:tab w:val="left" w:leader="hyphen" w:pos="8504"/>
+        </w:tabs>
+        <w:spacing w:after="60" w:line="340" w:lineRule="auto"/>
       </w:pPr>
       <w:r>
-        <w:t xml:space="preserve">- {{t_genre}} </w:t>
+        <w:rPr>
+          <w:rFonts w:ascii="Traditional Arabic" w:hAnsi="Traditional Arabic" w:cs="Traditional Arabic"/>
+          <w:sz w:val="26"/>
+          <w:szCs w:val="26"/>
+          <w:rtl/>
+        </w:rPr>
+        <w:t xml:space="preserve">{{t_index}}) - {{t_genre}} </w:t>
       </w:r>
       <w:r>
         <w:rPr>
+          <w:rFonts w:ascii="Traditional Arabic" w:hAnsi="Traditional Arabic" w:cs="Traditional Arabic"/>
           <w:b/>
+          <w:bCs/>
+          <w:sz w:val="26"/>
+          <w:szCs w:val="26"/>
+          <w:rtl/>
         </w:rPr>
         <w:t>{{t_nom}} {{t_prenom}}</w:t>
       </w:r>
       <w:r>
+        <w:rPr>
+          <w:rFonts w:ascii="Traditional Arabic" w:hAnsi="Traditional Arabic" w:cs="Traditional Arabic"/>
+          <w:sz w:val="26"/>
+          <w:szCs w:val="26"/>
+          <w:rtl/>
+        </w:rPr>
         <w:t xml:space="preserve">، جزائري{{t_nat}} الجنسية، {{t_ne}} بتاريخ </w:t>
       </w:r>
       <w:r>
         <w:rPr>
+          <w:rFonts w:ascii="Traditional Arabic" w:hAnsi="Traditional Arabic" w:cs="Traditional Arabic"/>
           <w:b/>
+          <w:bCs/>
+          <w:sz w:val="26"/>
+          <w:szCs w:val="26"/>
+          <w:rtl/>
         </w:rPr>
         <w:t>{{t_date_naiss}}</w:t>
       </w:r>
       <w:r>
+        <w:rPr>
+          <w:rFonts w:ascii="Traditional Arabic" w:hAnsi="Traditional Arabic" w:cs="Traditional Arabic"/>
+          <w:sz w:val="26"/>
+          <w:szCs w:val="26"/>
+          <w:rtl/>
+        </w:rPr>
         <w:t xml:space="preserve">، {{t_hab}} بـ </w:t>
       </w:r>
       <w:r>
         <w:rPr>
+          <w:rFonts w:ascii="Traditional Arabic" w:hAnsi="Traditional Arabic" w:cs="Traditional Arabic"/>
           <w:b/>
+          <w:bCs/>
+          <w:sz w:val="26"/>
+          <w:szCs w:val="26"/>
+          <w:rtl/>
         </w:rPr>
         <w:t>{{t_adresse}}</w:t>
       </w:r>
       <w:r>
-        <w:t>.</w:t>
+        <w:rPr>
+          <w:rFonts w:ascii="Traditional Arabic" w:hAnsi="Traditional Arabic" w:cs="Traditional Arabic"/>
+          <w:sz w:val="26"/>
+          <w:szCs w:val="26"/>
+          <w:rtl/>
+        </w:rPr>
+        <w:t xml:space="preserve">. </w:t>
+      </w:r>
+      <w:r>
+        <w:tab/>
+      </w:r>
+      <w:r>
+        <w:rPr>
+          <w:sz w:val="24"/>
+        </w:rPr>
+        <w:t>-</w:t>
       </w:r>
     </w:p>
     <w:p>
       <w:pPr>
-        <w:jc w:val="right"/>
+        <w:bidi/>
       </w:pPr>
       <w:r>
         <w:t>{{/temoins}}</w:t>
@@ -235,26 +412,52 @@
     </w:p>
     <w:p>
       <w:pPr>
-        <w:jc w:val="right"/>
+        <w:bidi/>
+        <w:spacing w:before="80" w:after="160" w:line="340" w:lineRule="auto"/>
       </w:pPr>
       <w:r>
-        <w:t>اللذان صرحا بمعرفتهما التامة ل{{defunt_titre}}، وأقرا بأن ورثته شرعاً وقانوناً هم المذكورون أسفله :</w:t>
+        <w:rPr>
+          <w:rFonts w:ascii="Traditional Arabic" w:hAnsi="Traditional Arabic" w:cs="Traditional Arabic"/>
+          <w:sz w:val="26"/>
+          <w:szCs w:val="26"/>
+          <w:rtl/>
+        </w:rPr>
+        <w:t>اللذان صرحا بمعرفتهما التامة {{defunt_pour_temoins}}، وأقرا بأن ورثته شرعاً وقانوناً هم المذكورون أسفله :</w:t>
+      </w:r>
+    </w:p>
+    <!-- 1ère liste nominative des héritiers : الـورثـة (identité complète, date et lieu de naissance, NIN - sans fraction) -->
+    <w:p>
+      <w:pPr>
+        <w:bidi/>
+        <w:tabs>
+          <w:tab w:val="left" w:leader="hyphen" w:pos="8504"/>
+        </w:tabs>
+        <w:spacing w:before="120" w:after="80" w:line="340" w:lineRule="auto"/>
+      </w:pPr>
+      <w:r>
+        <w:rPr>
+          <w:rFonts w:ascii="Traditional Arabic" w:hAnsi="Traditional Arabic" w:cs="Traditional Arabic"/>
+          <w:b/>
+          <w:bCs/>
+          <w:sz w:val="28"/>
+          <w:szCs w:val="28"/>
+          <w:rtl/>
+        </w:rPr>
+        <w:t xml:space="preserve">الـورثـة : </w:t>
+      </w:r>
+      <w:r>
+        <w:tab/>
+      </w:r>
+      <w:r>
+        <w:rPr>
+          <w:sz w:val="24"/>
+        </w:rPr>
+        <w:t>-</w:t>
       </w:r>
     </w:p>
     <w:p>
       <w:pPr>
-        <w:jc w:val="right"/>
-      </w:pPr>
-      <w:r>
-        <w:rPr>
-          <w:b/>
-        </w:rPr>
-        <w:t>الـورثـة :</w:t>
-      </w:r>
-    </w:p>
-    <w:p>
-      <w:pPr>
-        <w:jc w:val="right"/>
+        <w:bidi/>
       </w:pPr>
       <w:r>
         <w:t>{{?heritiers}}</w:t>
@@ -262,84 +465,159 @@
     </w:p>
     <w:p>
       <w:pPr>
-        <w:jc w:val="right"/>
+        <w:bidi/>
+        <w:tabs>
+          <w:tab w:val="left" w:leader="hyphen" w:pos="8504"/>
+        </w:tabs>
+        <w:spacing w:after="60" w:line="340" w:lineRule="auto"/>
       </w:pPr>
       <w:r>
+        <w:rPr>
+          <w:rFonts w:ascii="Traditional Arabic" w:hAnsi="Traditional Arabic" w:cs="Traditional Arabic"/>
+          <w:sz w:val="26"/>
+          <w:szCs w:val="26"/>
+          <w:rtl/>
+        </w:rPr>
         <w:t xml:space="preserve">- </w:t>
       </w:r>
       <w:r>
         <w:rPr>
+          <w:rFonts w:ascii="Traditional Arabic" w:hAnsi="Traditional Arabic" w:cs="Traditional Arabic"/>
           <w:b/>
+          <w:bCs/>
+          <w:sz w:val="26"/>
+          <w:szCs w:val="26"/>
+          <w:rtl/>
         </w:rPr>
         <w:t xml:space="preserve">{{h_relation_exacte}} </w:t>
       </w:r>
       <w:r>
         <w:rPr>
+          <w:rFonts w:ascii="Traditional Arabic" w:hAnsi="Traditional Arabic" w:cs="Traditional Arabic"/>
           <w:b/>
+          <w:bCs/>
+          <w:sz w:val="26"/>
+          <w:szCs w:val="26"/>
+          <w:rtl/>
         </w:rPr>
         <w:t>{{h_nom}} {{h_prenom}}</w:t>
       </w:r>
       <w:r>
+        <w:rPr>
+          <w:rFonts w:ascii="Traditional Arabic" w:hAnsi="Traditional Arabic" w:cs="Traditional Arabic"/>
+          <w:sz w:val="26"/>
+          <w:szCs w:val="26"/>
+          <w:rtl/>
+        </w:rPr>
         <w:t xml:space="preserve">، {{h_ne}} </w:t>
       </w:r>
       <w:r>
         <w:rPr>
+          <w:rFonts w:ascii="Traditional Arabic" w:hAnsi="Traditional Arabic" w:cs="Traditional Arabic"/>
           <w:b/>
+          <w:bCs/>
+          <w:sz w:val="26"/>
+          <w:szCs w:val="26"/>
+          <w:rtl/>
         </w:rPr>
         <w:t>{{h_date_naiss}}</w:t>
       </w:r>
       <w:r>
-        <w:t>{{h_nin_text}}</w:t>
+        <w:rPr>
+          <w:rFonts w:ascii="Traditional Arabic" w:hAnsi="Traditional Arabic" w:cs="Traditional Arabic"/>
+          <w:sz w:val="26"/>
+          <w:szCs w:val="26"/>
+          <w:rtl/>
+        </w:rPr>
+        <w:t xml:space="preserve">{{h_nin_text}} </w:t>
       </w:r>
       <w:r>
-        <w:t xml:space="preserve"> - الحصة : </w:t>
+        <w:tab/>
       </w:r>
       <w:r>
         <w:rPr>
-          <w:b/>
+          <w:sz w:val="24"/>
         </w:rPr>
-        <w:t>{{h_part}}</w:t>
+        <w:t>-</w:t>
       </w:r>
     </w:p>
     <w:p>
       <w:pPr>
-        <w:jc w:val="right"/>
+        <w:bidi/>
       </w:pPr>
       <w:r>
         <w:t>{{/heritiers}}</w:t>
       </w:r>
     </w:p>
+    <!-- 2ème liste nominative des héritiers : الـقـسـمـة (parenté, nom, prénom, traits d'union serrés et fraction en fin de ligne) -->
     <w:p>
       <w:pPr>
-        <w:jc w:val="right"/>
+        <w:bidi/>
+        <w:tabs>
+          <w:tab w:val="left" w:leader="hyphen" w:pos="8504"/>
+        </w:tabs>
+        <w:spacing w:before="160" w:after="80" w:line="340" w:lineRule="auto"/>
       </w:pPr>
       <w:r>
         <w:rPr>
+          <w:rFonts w:ascii="Traditional Arabic" w:hAnsi="Traditional Arabic" w:cs="Traditional Arabic"/>
           <w:b/>
+          <w:bCs/>
+          <w:sz w:val="28"/>
+          <w:szCs w:val="28"/>
+          <w:rtl/>
         </w:rPr>
-        <w:t>الـقـسـمـة :</w:t>
+        <w:t xml:space="preserve">الـقـسـمـة : </w:t>
+      </w:r>
+      <w:r>
+        <w:tab/>
+      </w:r>
+      <w:r>
+        <w:rPr>
+          <w:sz w:val="24"/>
+        </w:rPr>
+        <w:t>-</w:t>
       </w:r>
     </w:p>
     <w:p>
       <w:pPr>
-        <w:jc w:val="right"/>
+        <w:bidi/>
+        <w:spacing w:after="160" w:line="360" w:lineRule="auto"/>
+        <w:jc w:val="both"/>
       </w:pPr>
       <w:r>
-        <w:t xml:space="preserve">وقد صحت بعد العمل والحساب من أصل </w:t>
+        <w:rPr>
+          <w:rFonts w:ascii="Traditional Arabic" w:hAnsi="Traditional Arabic" w:cs="Traditional Arabic"/>
+          <w:sz w:val="26"/>
+          <w:szCs w:val="26"/>
+          <w:rtl/>
+        </w:rPr>
+        <w:t xml:space="preserve">{{demandeur_intro}}وقد صحت بعد العمل والحساب من أصل </w:t>
       </w:r>
       <w:r>
         <w:rPr>
+          <w:rFonts w:ascii="Traditional Arabic" w:hAnsi="Traditional Arabic" w:cs="Traditional Arabic"/>
           <w:b/>
+          <w:bCs/>
+          <w:sz w:val="26"/>
+          <w:szCs w:val="26"/>
+          <w:rtl/>
         </w:rPr>
         <w:t>{{denominateur_lettres}}</w:t>
       </w:r>
       <w:r>
+        <w:rPr>
+          <w:rFonts w:ascii="Traditional Arabic" w:hAnsi="Traditional Arabic" w:cs="Traditional Arabic"/>
+          <w:sz w:val="26"/>
+          <w:szCs w:val="26"/>
+          <w:rtl/>
+        </w:rPr>
         <w:t xml:space="preserve"> حصة ( {{denominateur}} )، موزعة على النحو التالي :</w:t>
       </w:r>
     </w:p>
     <w:p>
       <w:pPr>
-        <w:jc w:val="right"/>
+        <w:bidi/>
       </w:pPr>
       <w:r>
         <w:t>{{?heritiers_parts}}</w:t>
@@ -347,67 +625,129 @@
     </w:p>
     <w:p>
       <w:pPr>
-        <w:jc w:val="right"/>
+        <w:bidi/>
+        <w:tabs>
+          <w:tab w:val="left" w:leader="hyphen" w:pos="8504"/>
+        </w:tabs>
+        <w:spacing w:after="80" w:line="340" w:lineRule="auto"/>
       </w:pPr>
       <w:r>
+        <w:rPr>
+          <w:rFonts w:ascii="Traditional Arabic" w:hAnsi="Traditional Arabic" w:cs="Traditional Arabic"/>
+          <w:sz w:val="26"/>
+          <w:szCs w:val="26"/>
+          <w:rtl/>
+        </w:rPr>
         <w:t xml:space="preserve">- </w:t>
       </w:r>
       <w:r>
         <w:rPr>
+          <w:rFonts w:ascii="Traditional Arabic" w:hAnsi="Traditional Arabic" w:cs="Traditional Arabic"/>
           <w:b/>
+          <w:bCs/>
+          <w:sz w:val="26"/>
+          <w:szCs w:val="26"/>
+          <w:rtl/>
         </w:rPr>
         <w:t xml:space="preserve">{{h_groupe}} </w:t>
       </w:r>
       <w:r>
         <w:rPr>
+          <w:rFonts w:ascii="Traditional Arabic" w:hAnsi="Traditional Arabic" w:cs="Traditional Arabic"/>
           <w:b/>
+          <w:bCs/>
+          <w:sz w:val="26"/>
+          <w:szCs w:val="26"/>
+          <w:rtl/>
         </w:rPr>
-        <w:t>{{h_nom_prenom}}</w:t>
+        <w:t xml:space="preserve">{{h_nom_prenom}} </w:t>
       </w:r>
       <w:r>
-        <w:t xml:space="preserve"> : </w:t>
+        <w:tab/>
       </w:r>
       <w:r>
         <w:rPr>
+          <w:rFonts w:ascii="Traditional Arabic" w:hAnsi="Traditional Arabic" w:cs="Traditional Arabic"/>
           <w:b/>
+          <w:bCs/>
+          <w:sz w:val="28"/>
+          <w:szCs w:val="28"/>
         </w:rPr>
-        <w:t>{{h_num}} / {{h_den}}</w:t>
+        <w:t xml:space="preserve"> {{h_fraction}}</w:t>
       </w:r>
     </w:p>
     <w:p>
       <w:pPr>
-        <w:jc w:val="right"/>
+        <w:bidi/>
       </w:pPr>
       <w:r>
         <w:t>{{/heritiers_parts}}</w:t>
       </w:r>
     </w:p>
+    <!-- Ligne المجموع -->
     <w:p>
       <w:pPr>
-        <w:jc w:val="right"/>
+        <w:bidi/>
+        <w:pBdr>
+          <w:top w:val="dotted" w:sz="6" w:space="4" w:color="999999"/>
+        </w:pBdr>
+        <w:tabs>
+          <w:tab w:val="left" w:leader="hyphen" w:pos="8504"/>
+        </w:tabs>
+        <w:spacing w:before="120" w:after="160" w:line="340" w:lineRule="auto"/>
       </w:pPr>
       <w:r>
-        <w:t xml:space="preserve">- المجموع : </w:t>
+        <w:rPr>
+          <w:rFonts w:ascii="Traditional Arabic" w:hAnsi="Traditional Arabic" w:cs="Traditional Arabic"/>
+          <w:b/>
+          <w:bCs/>
+          <w:sz w:val="28"/>
+          <w:szCs w:val="28"/>
+          <w:rtl/>
+        </w:rPr>
+        <w:t xml:space="preserve">- المجموع </w:t>
+      </w:r>
+      <w:r>
+        <w:tab/>
       </w:r>
       <w:r>
         <w:rPr>
+          <w:rFonts w:ascii="Traditional Arabic" w:hAnsi="Traditional Arabic" w:cs="Traditional Arabic"/>
           <w:b/>
+          <w:bCs/>
+          <w:sz w:val="28"/>
+          <w:szCs w:val="28"/>
         </w:rPr>
-        <w:t>{{total_num}} / {{denominateur}}</w:t>
+        <w:t xml:space="preserve"> {{total_fraction}}</w:t>
       </w:r>
     </w:p>
+    <!-- Signature : التأشير والختم (الموثق) alignée à gauche -->
     <w:p>
       <w:pPr>
-        <w:spacing w:before="600"/>
+        <w:bidi w:val="0"/>
+        <w:spacing w:before="480" w:line="340" w:lineRule="auto"/>
+        <w:ind w:left="720"/>
         <w:jc w:val="left"/>
       </w:pPr>
       <w:r>
-        <w:t>توقيع وختم الموثق(ة)</w:t>
+        <w:rPr>
+          <w:rFonts w:ascii="Traditional Arabic" w:hAnsi="Traditional Arabic" w:cs="Traditional Arabic"/>
+          <w:b/>
+          <w:bCs/>
+          <w:sz w:val="32"/>
+          <w:szCs w:val="32"/>
+          <w:rtl/>
+        </w:rPr>
+        <w:t>التأشير والختم</w:t>
+        <w:br/>
+        <w:t>(الموثق)</w:t>
       </w:r>
     </w:p>
+    <!-- Format A4 (11906 x 16838 twips) et Marges : Droite 5 cm (2835 twips), Gauche 1 cm (567 twips) -->
     <w:sectPr>
-      <w:pgSz w:w="12240" w:h="15840"/>
-      <w:pgMar w:top="1440" w:right="1800" w:bottom="1440" w:left="1800" w:header="720" w:footer="720" w:gutter="0"/>
+      <w:bidi/>
+      <w:pgSz w:w="11906" w:h="16838"/>
+      <w:pgMar w:top="1134" w:right="2835" w:bottom="1134" w:left="567" w:header="720" w:footer="720" w:gutter="0"/>
       <w:cols w:space="720"/>
       <w:docGrid w:linePitch="360"/>
     </w:sectPr>

</xml_diff>

<commit_message>
fix(ocr-demo): synchroniser le decodage QR acte de deces (adc_01) et extrait de naissance avec la version locale
</commit_message>
<xml_diff>
--- a/backend/src/main/resources/templates/modele_frida.docx
+++ b/backend/src/main/resources/templates/modele_frida.docx
@@ -282,7 +282,7 @@
       <w:pPr>
         <w:bidi/>
         <w:tabs>
-          <w:tab w:val="left" w:leader="hyphen" w:pos="8504"/>
+          <w:tab w:val="left" w:leader="hyphen" w:pos="8300"/>
         </w:tabs>
         <w:spacing w:before="120" w:after="80" w:line="340" w:lineRule="auto"/>
       </w:pPr>
@@ -319,7 +319,7 @@
       <w:pPr>
         <w:bidi/>
         <w:tabs>
-          <w:tab w:val="left" w:leader="hyphen" w:pos="8504"/>
+          <w:tab w:val="left" w:leader="hyphen" w:pos="8300"/>
         </w:tabs>
         <w:spacing w:after="60" w:line="340" w:lineRule="auto"/>
       </w:pPr>
@@ -430,7 +430,7 @@
       <w:pPr>
         <w:bidi/>
         <w:tabs>
-          <w:tab w:val="left" w:leader="hyphen" w:pos="8504"/>
+          <w:tab w:val="left" w:leader="hyphen" w:pos="8300"/>
         </w:tabs>
         <w:spacing w:before="120" w:after="80" w:line="340" w:lineRule="auto"/>
       </w:pPr>
@@ -467,7 +467,7 @@
       <w:pPr>
         <w:bidi/>
         <w:tabs>
-          <w:tab w:val="left" w:leader="hyphen" w:pos="8504"/>
+          <w:tab w:val="left" w:leader="hyphen" w:pos="8300"/>
         </w:tabs>
         <w:spacing w:after="60" w:line="340" w:lineRule="auto"/>
       </w:pPr>
@@ -529,6 +529,26 @@
           <w:szCs w:val="26"/>
           <w:rtl/>
         </w:rPr>
+        <w:t xml:space="preserve">{{h_lieu_prefix}}</w:t>
+      </w:r>
+      <w:r>
+        <w:rPr>
+          <w:rFonts w:ascii="Traditional Arabic" w:hAnsi="Traditional Arabic" w:cs="Traditional Arabic"/>
+          <w:b/>
+          <w:bCs/>
+          <w:sz w:val="26"/>
+          <w:szCs w:val="26"/>
+          <w:rtl/>
+        </w:rPr>
+        <w:t>{{h_lieu_naiss}}</w:t>
+      </w:r>
+      <w:r>
+        <w:rPr>
+          <w:rFonts w:ascii="Traditional Arabic" w:hAnsi="Traditional Arabic" w:cs="Traditional Arabic"/>
+          <w:sz w:val="26"/>
+          <w:szCs w:val="26"/>
+          <w:rtl/>
+        </w:rPr>
         <w:t xml:space="preserve">{{h_nin_text}} </w:t>
       </w:r>
       <w:r>
@@ -554,7 +574,7 @@
       <w:pPr>
         <w:bidi/>
         <w:tabs>
-          <w:tab w:val="left" w:leader="hyphen" w:pos="8504"/>
+          <w:tab w:val="left" w:leader="hyphen" w:pos="8300"/>
         </w:tabs>
         <w:spacing w:before="160" w:after="80" w:line="340" w:lineRule="auto"/>
       </w:pPr>
@@ -627,7 +647,7 @@
       <w:pPr>
         <w:bidi/>
         <w:tabs>
-          <w:tab w:val="left" w:leader="hyphen" w:pos="8504"/>
+          <w:tab w:val="left" w:leader="hyphen" w:pos="7350"/>
         </w:tabs>
         <w:spacing w:after="80" w:line="340" w:lineRule="auto"/>
       </w:pPr>
@@ -673,7 +693,7 @@
           <w:sz w:val="28"/>
           <w:szCs w:val="28"/>
         </w:rPr>
-        <w:t xml:space="preserve"> {{h_fraction}}</w:t>
+        <w:t>{{h_fraction}}</w:t>
       </w:r>
     </w:p>
     <w:p>
@@ -692,7 +712,7 @@
           <w:top w:val="dotted" w:sz="6" w:space="4" w:color="999999"/>
         </w:pBdr>
         <w:tabs>
-          <w:tab w:val="left" w:leader="hyphen" w:pos="8504"/>
+          <w:tab w:val="left" w:leader="hyphen" w:pos="7350"/>
         </w:tabs>
         <w:spacing w:before="120" w:after="160" w:line="340" w:lineRule="auto"/>
       </w:pPr>
@@ -718,7 +738,7 @@
           <w:sz w:val="28"/>
           <w:szCs w:val="28"/>
         </w:rPr>
-        <w:t xml:space="preserve"> {{total_fraction}}</w:t>
+        <w:t>{{total_fraction}}</w:t>
       </w:r>
     </w:p>
     <!-- Signature : التأشير والختم (الموثق) alignée à gauche -->

</xml_diff>